<commit_message>
docs: align product claims with verified behavior
</commit_message>
<xml_diff>
--- a/Compass_Product_and_Technical_Report.docx
+++ b/Compass_Product_and_Technical_Report.docx
@@ -92,7 +92,7 @@
         </w:rPr>
         <w:t>Prepared from the current Compass implementation</w:t>
         <w:br/>
-        <w:t>25 July 2026</w:t>
+        <w:t>21 August 2026</w:t>
       </w:r>
     </w:p>
     <w:p>
@@ -298,12 +298,9 @@
     <w:tbl>
       <w:tblPr>
         <w:tblStyle w:val="TableGrid"/>
-        <w:tblW w:type="auto" w:w="0"/>
+        <w:tblW w:type="dxa" w:w="9360"/>
         <w:tblLayout w:type="fixed"/>
         <w:tblLook w:firstColumn="1" w:firstRow="1" w:lastColumn="0" w:lastRow="0" w:noHBand="0" w:noVBand="1" w:val="04A0"/>
-        <w:tblW w:w="9360" w:type="dxa"/>
-        <w:tblInd w:w="120" w:type="dxa"/>
-        <w:tblW w:w="9360" w:type="dxa"/>
         <w:tblInd w:w="120" w:type="dxa"/>
       </w:tblPr>
       <w:tblGrid>
@@ -317,21 +314,15 @@
         </w:trPr>
         <w:tc>
           <w:tcPr>
-            <w:tcW w:type="dxa" w:w="3120"/>
-            <w:tcW w:w="2100" w:type="dxa"/>
+            <w:tcW w:type="dxa" w:w="2100"/>
             <w:vAlign w:val="center"/>
             <w:tcMar>
               <w:top w:w="80" w:type="dxa"/>
               <w:start w:w="120" w:type="dxa"/>
               <w:bottom w:w="80" w:type="dxa"/>
               <w:end w:w="120" w:type="dxa"/>
-              <w:top w:w="80" w:type="dxa"/>
-              <w:start w:w="120" w:type="dxa"/>
-              <w:bottom w:w="80" w:type="dxa"/>
-              <w:end w:w="120" w:type="dxa"/>
             </w:tcMar>
             <w:shd w:fill="E8EEF8"/>
-            <w:tcW w:w="2100" w:type="dxa"/>
           </w:tcPr>
           <w:p>
             <w:pPr>
@@ -351,21 +342,15 @@
         </w:tc>
         <w:tc>
           <w:tcPr>
-            <w:tcW w:type="dxa" w:w="3120"/>
-            <w:tcW w:w="5000" w:type="dxa"/>
+            <w:tcW w:type="dxa" w:w="5000"/>
             <w:vAlign w:val="center"/>
             <w:tcMar>
               <w:top w:w="80" w:type="dxa"/>
               <w:start w:w="120" w:type="dxa"/>
               <w:bottom w:w="80" w:type="dxa"/>
               <w:end w:w="120" w:type="dxa"/>
-              <w:top w:w="80" w:type="dxa"/>
-              <w:start w:w="120" w:type="dxa"/>
-              <w:bottom w:w="80" w:type="dxa"/>
-              <w:end w:w="120" w:type="dxa"/>
             </w:tcMar>
             <w:shd w:fill="E8EEF8"/>
-            <w:tcW w:w="5000" w:type="dxa"/>
           </w:tcPr>
           <w:p>
             <w:pPr>
@@ -385,21 +370,15 @@
         </w:tc>
         <w:tc>
           <w:tcPr>
-            <w:tcW w:type="dxa" w:w="3120"/>
-            <w:tcW w:w="2260" w:type="dxa"/>
+            <w:tcW w:type="dxa" w:w="2260"/>
             <w:vAlign w:val="center"/>
             <w:tcMar>
               <w:top w:w="80" w:type="dxa"/>
               <w:start w:w="120" w:type="dxa"/>
               <w:bottom w:w="80" w:type="dxa"/>
               <w:end w:w="120" w:type="dxa"/>
-              <w:top w:w="80" w:type="dxa"/>
-              <w:start w:w="120" w:type="dxa"/>
-              <w:bottom w:w="80" w:type="dxa"/>
-              <w:end w:w="120" w:type="dxa"/>
             </w:tcMar>
             <w:shd w:fill="E8EEF8"/>
-            <w:tcW w:w="2260" w:type="dxa"/>
           </w:tcPr>
           <w:p>
             <w:pPr>
@@ -423,7 +402,6 @@
           <w:tcPr>
             <w:tcW w:type="dxa" w:w="2100"/>
             <w:shd w:fill="F2F4F7"/>
-            <w:tcW w:w="2100" w:type="dxa"/>
             <w:vAlign w:val="center"/>
             <w:tcMar>
               <w:top w:w="80" w:type="dxa"/>
@@ -451,7 +429,6 @@
         <w:tc>
           <w:tcPr>
             <w:tcW w:type="dxa" w:w="5000"/>
-            <w:tcW w:w="5000" w:type="dxa"/>
             <w:vAlign w:val="center"/>
             <w:tcMar>
               <w:top w:w="80" w:type="dxa"/>
@@ -479,7 +456,6 @@
         <w:tc>
           <w:tcPr>
             <w:tcW w:type="dxa" w:w="2260"/>
-            <w:tcW w:w="2260" w:type="dxa"/>
             <w:vAlign w:val="center"/>
             <w:tcMar>
               <w:top w:w="80" w:type="dxa"/>
@@ -510,7 +486,6 @@
           <w:tcPr>
             <w:tcW w:type="dxa" w:w="2100"/>
             <w:shd w:fill="F2F4F7"/>
-            <w:tcW w:w="2100" w:type="dxa"/>
             <w:vAlign w:val="center"/>
             <w:tcMar>
               <w:top w:w="80" w:type="dxa"/>
@@ -538,7 +513,6 @@
         <w:tc>
           <w:tcPr>
             <w:tcW w:type="dxa" w:w="5000"/>
-            <w:tcW w:w="5000" w:type="dxa"/>
             <w:vAlign w:val="center"/>
             <w:tcMar>
               <w:top w:w="80" w:type="dxa"/>
@@ -559,14 +533,13 @@
                 <w:color w:val="172027"/>
                 <w:sz w:val="18"/>
               </w:rPr>
-              <w:t>Ask, Edit, Plan and Goal modes route work through planning, tools, guardrails, recovery and evaluation.</w:t>
+              <w:t>Ask, Edit, Plan and Goal modes route through one executor spine with typed interrupts, tools, recovery and evaluation.</w:t>
             </w:r>
           </w:p>
         </w:tc>
         <w:tc>
           <w:tcPr>
             <w:tcW w:type="dxa" w:w="2260"/>
-            <w:tcW w:w="2260" w:type="dxa"/>
             <w:vAlign w:val="center"/>
             <w:tcMar>
               <w:top w:w="80" w:type="dxa"/>
@@ -597,7 +570,6 @@
           <w:tcPr>
             <w:tcW w:type="dxa" w:w="2100"/>
             <w:shd w:fill="F2F4F7"/>
-            <w:tcW w:w="2100" w:type="dxa"/>
             <w:vAlign w:val="center"/>
             <w:tcMar>
               <w:top w:w="80" w:type="dxa"/>
@@ -625,7 +597,6 @@
         <w:tc>
           <w:tcPr>
             <w:tcW w:type="dxa" w:w="5000"/>
-            <w:tcW w:w="5000" w:type="dxa"/>
             <w:vAlign w:val="center"/>
             <w:tcMar>
               <w:top w:w="80" w:type="dxa"/>
@@ -644,16 +615,15 @@
                 <w:b w:val="0"/>
                 <w:i w:val="0"/>
                 <w:color w:val="172027"/>
-                <w:sz w:val="20"/>
+                <w:sz w:val="18"/>
               </w:rPr>
-              <w:t>File search, semantic retrieval/RAG, pinned files, session history, skills and task state.</w:t>
+              <w:t>File search and pinned context work directly; semantic retrieval and memory require embedding configuration and credentials.</w:t>
             </w:r>
           </w:p>
         </w:tc>
         <w:tc>
           <w:tcPr>
             <w:tcW w:type="dxa" w:w="2260"/>
-            <w:tcW w:w="2260" w:type="dxa"/>
             <w:vAlign w:val="center"/>
             <w:tcMar>
               <w:top w:w="80" w:type="dxa"/>
@@ -684,7 +654,6 @@
           <w:tcPr>
             <w:tcW w:type="dxa" w:w="2100"/>
             <w:shd w:fill="F2F4F7"/>
-            <w:tcW w:w="2100" w:type="dxa"/>
             <w:vAlign w:val="center"/>
             <w:tcMar>
               <w:top w:w="80" w:type="dxa"/>
@@ -712,7 +681,6 @@
         <w:tc>
           <w:tcPr>
             <w:tcW w:type="dxa" w:w="5000"/>
-            <w:tcW w:w="5000" w:type="dxa"/>
             <w:vAlign w:val="center"/>
             <w:tcMar>
               <w:top w:w="80" w:type="dxa"/>
@@ -740,7 +708,6 @@
         <w:tc>
           <w:tcPr>
             <w:tcW w:type="dxa" w:w="2260"/>
-            <w:tcW w:w="2260" w:type="dxa"/>
             <w:vAlign w:val="center"/>
             <w:tcMar>
               <w:top w:w="80" w:type="dxa"/>
@@ -771,7 +738,6 @@
           <w:tcPr>
             <w:tcW w:type="dxa" w:w="2100"/>
             <w:shd w:fill="F2F4F7"/>
-            <w:tcW w:w="2100" w:type="dxa"/>
             <w:vAlign w:val="center"/>
             <w:tcMar>
               <w:top w:w="80" w:type="dxa"/>
@@ -799,7 +765,6 @@
         <w:tc>
           <w:tcPr>
             <w:tcW w:type="dxa" w:w="5000"/>
-            <w:tcW w:w="5000" w:type="dxa"/>
             <w:vAlign w:val="center"/>
             <w:tcMar>
               <w:top w:w="80" w:type="dxa"/>
@@ -827,7 +792,6 @@
         <w:tc>
           <w:tcPr>
             <w:tcW w:type="dxa" w:w="2260"/>
-            <w:tcW w:w="2260" w:type="dxa"/>
             <w:vAlign w:val="center"/>
             <w:tcMar>
               <w:top w:w="80" w:type="dxa"/>
@@ -858,7 +822,6 @@
           <w:tcPr>
             <w:tcW w:type="dxa" w:w="2100"/>
             <w:shd w:fill="F2F4F7"/>
-            <w:tcW w:w="2100" w:type="dxa"/>
             <w:vAlign w:val="center"/>
             <w:tcMar>
               <w:top w:w="80" w:type="dxa"/>
@@ -886,7 +849,6 @@
         <w:tc>
           <w:tcPr>
             <w:tcW w:type="dxa" w:w="5000"/>
-            <w:tcW w:w="5000" w:type="dxa"/>
             <w:vAlign w:val="center"/>
             <w:tcMar>
               <w:top w:w="80" w:type="dxa"/>
@@ -914,7 +876,6 @@
         <w:tc>
           <w:tcPr>
             <w:tcW w:type="dxa" w:w="2260"/>
-            <w:tcW w:w="2260" w:type="dxa"/>
             <w:vAlign w:val="center"/>
             <w:tcMar>
               <w:top w:w="80" w:type="dxa"/>
@@ -957,12 +918,9 @@
     <w:tbl>
       <w:tblPr>
         <w:tblStyle w:val="TableGrid"/>
-        <w:tblW w:type="auto" w:w="0"/>
+        <w:tblW w:type="dxa" w:w="9360"/>
         <w:tblLayout w:type="fixed"/>
         <w:tblLook w:firstColumn="1" w:firstRow="1" w:lastColumn="0" w:lastRow="0" w:noHBand="0" w:noVBand="1" w:val="04A0"/>
-        <w:tblW w:w="9360" w:type="dxa"/>
-        <w:tblInd w:w="120" w:type="dxa"/>
-        <w:tblW w:w="9360" w:type="dxa"/>
         <w:tblInd w:w="120" w:type="dxa"/>
       </w:tblPr>
       <w:tblGrid>
@@ -976,21 +934,15 @@
         </w:trPr>
         <w:tc>
           <w:tcPr>
-            <w:tcW w:type="dxa" w:w="3120"/>
-            <w:tcW w:w="1750" w:type="dxa"/>
+            <w:tcW w:type="dxa" w:w="1750"/>
             <w:vAlign w:val="center"/>
             <w:tcMar>
               <w:top w:w="80" w:type="dxa"/>
               <w:start w:w="120" w:type="dxa"/>
               <w:bottom w:w="80" w:type="dxa"/>
               <w:end w:w="120" w:type="dxa"/>
-              <w:top w:w="80" w:type="dxa"/>
-              <w:start w:w="120" w:type="dxa"/>
-              <w:bottom w:w="80" w:type="dxa"/>
-              <w:end w:w="120" w:type="dxa"/>
             </w:tcMar>
             <w:shd w:fill="E8EEF8"/>
-            <w:tcW w:w="1750" w:type="dxa"/>
           </w:tcPr>
           <w:p>
             <w:pPr>
@@ -1010,21 +962,15 @@
         </w:tc>
         <w:tc>
           <w:tcPr>
-            <w:tcW w:type="dxa" w:w="3120"/>
-            <w:tcW w:w="3500" w:type="dxa"/>
+            <w:tcW w:type="dxa" w:w="3500"/>
             <w:vAlign w:val="center"/>
             <w:tcMar>
               <w:top w:w="80" w:type="dxa"/>
               <w:start w:w="120" w:type="dxa"/>
               <w:bottom w:w="80" w:type="dxa"/>
               <w:end w:w="120" w:type="dxa"/>
-              <w:top w:w="80" w:type="dxa"/>
-              <w:start w:w="120" w:type="dxa"/>
-              <w:bottom w:w="80" w:type="dxa"/>
-              <w:end w:w="120" w:type="dxa"/>
             </w:tcMar>
             <w:shd w:fill="E8EEF8"/>
-            <w:tcW w:w="3500" w:type="dxa"/>
           </w:tcPr>
           <w:p>
             <w:pPr>
@@ -1044,21 +990,15 @@
         </w:tc>
         <w:tc>
           <w:tcPr>
-            <w:tcW w:type="dxa" w:w="3120"/>
-            <w:tcW w:w="4110" w:type="dxa"/>
+            <w:tcW w:type="dxa" w:w="4110"/>
             <w:vAlign w:val="center"/>
             <w:tcMar>
               <w:top w:w="80" w:type="dxa"/>
               <w:start w:w="120" w:type="dxa"/>
               <w:bottom w:w="80" w:type="dxa"/>
               <w:end w:w="120" w:type="dxa"/>
-              <w:top w:w="80" w:type="dxa"/>
-              <w:start w:w="120" w:type="dxa"/>
-              <w:bottom w:w="80" w:type="dxa"/>
-              <w:end w:w="120" w:type="dxa"/>
             </w:tcMar>
             <w:shd w:fill="E8EEF8"/>
-            <w:tcW w:w="4110" w:type="dxa"/>
           </w:tcPr>
           <w:p>
             <w:pPr>
@@ -1082,7 +1022,6 @@
           <w:tcPr>
             <w:tcW w:type="dxa" w:w="1750"/>
             <w:shd w:fill="F2F4F7"/>
-            <w:tcW w:w="1750" w:type="dxa"/>
             <w:vAlign w:val="center"/>
             <w:tcMar>
               <w:top w:w="80" w:type="dxa"/>
@@ -1110,7 +1049,6 @@
         <w:tc>
           <w:tcPr>
             <w:tcW w:type="dxa" w:w="3500"/>
-            <w:tcW w:w="3500" w:type="dxa"/>
             <w:vAlign w:val="center"/>
             <w:tcMar>
               <w:top w:w="80" w:type="dxa"/>
@@ -1138,7 +1076,6 @@
         <w:tc>
           <w:tcPr>
             <w:tcW w:type="dxa" w:w="4110"/>
-            <w:tcW w:w="4110" w:type="dxa"/>
             <w:vAlign w:val="center"/>
             <w:tcMar>
               <w:top w:w="80" w:type="dxa"/>
@@ -1169,7 +1106,6 @@
           <w:tcPr>
             <w:tcW w:type="dxa" w:w="1750"/>
             <w:shd w:fill="F2F4F7"/>
-            <w:tcW w:w="1750" w:type="dxa"/>
             <w:vAlign w:val="center"/>
             <w:tcMar>
               <w:top w:w="80" w:type="dxa"/>
@@ -1197,7 +1133,6 @@
         <w:tc>
           <w:tcPr>
             <w:tcW w:type="dxa" w:w="3500"/>
-            <w:tcW w:w="3500" w:type="dxa"/>
             <w:vAlign w:val="center"/>
             <w:tcMar>
               <w:top w:w="80" w:type="dxa"/>
@@ -1225,7 +1160,6 @@
         <w:tc>
           <w:tcPr>
             <w:tcW w:type="dxa" w:w="4110"/>
-            <w:tcW w:w="4110" w:type="dxa"/>
             <w:vAlign w:val="center"/>
             <w:tcMar>
               <w:top w:w="80" w:type="dxa"/>
@@ -1256,7 +1190,6 @@
           <w:tcPr>
             <w:tcW w:type="dxa" w:w="1750"/>
             <w:shd w:fill="F2F4F7"/>
-            <w:tcW w:w="1750" w:type="dxa"/>
             <w:vAlign w:val="center"/>
             <w:tcMar>
               <w:top w:w="80" w:type="dxa"/>
@@ -1284,7 +1217,6 @@
         <w:tc>
           <w:tcPr>
             <w:tcW w:type="dxa" w:w="3500"/>
-            <w:tcW w:w="3500" w:type="dxa"/>
             <w:vAlign w:val="center"/>
             <w:tcMar>
               <w:top w:w="80" w:type="dxa"/>
@@ -1312,7 +1244,6 @@
         <w:tc>
           <w:tcPr>
             <w:tcW w:type="dxa" w:w="4110"/>
-            <w:tcW w:w="4110" w:type="dxa"/>
             <w:vAlign w:val="center"/>
             <w:tcMar>
               <w:top w:w="80" w:type="dxa"/>
@@ -1343,7 +1274,6 @@
           <w:tcPr>
             <w:tcW w:type="dxa" w:w="1750"/>
             <w:shd w:fill="F2F4F7"/>
-            <w:tcW w:w="1750" w:type="dxa"/>
             <w:vAlign w:val="center"/>
             <w:tcMar>
               <w:top w:w="80" w:type="dxa"/>
@@ -1371,7 +1301,6 @@
         <w:tc>
           <w:tcPr>
             <w:tcW w:type="dxa" w:w="3500"/>
-            <w:tcW w:w="3500" w:type="dxa"/>
             <w:vAlign w:val="center"/>
             <w:tcMar>
               <w:top w:w="80" w:type="dxa"/>
@@ -1399,7 +1328,6 @@
         <w:tc>
           <w:tcPr>
             <w:tcW w:type="dxa" w:w="4110"/>
-            <w:tcW w:w="4110" w:type="dxa"/>
             <w:vAlign w:val="center"/>
             <w:tcMar>
               <w:top w:w="80" w:type="dxa"/>
@@ -1430,7 +1358,6 @@
           <w:tcPr>
             <w:tcW w:type="dxa" w:w="1750"/>
             <w:shd w:fill="F2F4F7"/>
-            <w:tcW w:w="1750" w:type="dxa"/>
             <w:vAlign w:val="center"/>
             <w:tcMar>
               <w:top w:w="80" w:type="dxa"/>
@@ -1458,7 +1385,6 @@
         <w:tc>
           <w:tcPr>
             <w:tcW w:type="dxa" w:w="3500"/>
-            <w:tcW w:w="3500" w:type="dxa"/>
             <w:vAlign w:val="center"/>
             <w:tcMar>
               <w:top w:w="80" w:type="dxa"/>
@@ -1486,7 +1412,6 @@
         <w:tc>
           <w:tcPr>
             <w:tcW w:type="dxa" w:w="4110"/>
-            <w:tcW w:w="4110" w:type="dxa"/>
             <w:vAlign w:val="center"/>
             <w:tcMar>
               <w:top w:w="80" w:type="dxa"/>
@@ -1517,7 +1442,6 @@
           <w:tcPr>
             <w:tcW w:type="dxa" w:w="1750"/>
             <w:shd w:fill="F2F4F7"/>
-            <w:tcW w:w="1750" w:type="dxa"/>
             <w:vAlign w:val="center"/>
             <w:tcMar>
               <w:top w:w="80" w:type="dxa"/>
@@ -1545,7 +1469,6 @@
         <w:tc>
           <w:tcPr>
             <w:tcW w:type="dxa" w:w="3500"/>
-            <w:tcW w:w="3500" w:type="dxa"/>
             <w:vAlign w:val="center"/>
             <w:tcMar>
               <w:top w:w="80" w:type="dxa"/>
@@ -1566,14 +1489,13 @@
                 <w:color w:val="172027"/>
                 <w:sz w:val="20"/>
               </w:rPr>
-              <w:t>NeMo Guardrails, JWT, OAuth, encryption, logging, rate limiting</w:t>
+              <w:t>Typed interrupts, tool policy, JWT/OAuth, encryption, logging and process-local limits</w:t>
             </w:r>
           </w:p>
         </w:tc>
         <w:tc>
           <w:tcPr>
             <w:tcW w:type="dxa" w:w="4110"/>
-            <w:tcW w:w="4110" w:type="dxa"/>
             <w:vAlign w:val="center"/>
             <w:tcMar>
               <w:top w:w="80" w:type="dxa"/>
@@ -1594,7 +1516,7 @@
                 <w:color w:val="172027"/>
                 <w:sz w:val="20"/>
               </w:rPr>
-              <w:t>Input/output policy, identity, credentials and operational visibility.</w:t>
+              <w:t>Approvals, identity, credentials and bounded single-process operation.</w:t>
             </w:r>
           </w:p>
         </w:tc>
@@ -1604,7 +1526,6 @@
           <w:tcPr>
             <w:tcW w:type="dxa" w:w="1750"/>
             <w:shd w:fill="F2F4F7"/>
-            <w:tcW w:w="1750" w:type="dxa"/>
             <w:vAlign w:val="center"/>
             <w:tcMar>
               <w:top w:w="80" w:type="dxa"/>
@@ -1632,7 +1553,6 @@
         <w:tc>
           <w:tcPr>
             <w:tcW w:type="dxa" w:w="3500"/>
-            <w:tcW w:w="3500" w:type="dxa"/>
             <w:vAlign w:val="center"/>
             <w:tcMar>
               <w:top w:w="80" w:type="dxa"/>
@@ -1660,7 +1580,6 @@
         <w:tc>
           <w:tcPr>
             <w:tcW w:type="dxa" w:w="4110"/>
-            <w:tcW w:w="4110" w:type="dxa"/>
             <w:vAlign w:val="center"/>
             <w:tcMar>
               <w:top w:w="80" w:type="dxa"/>
@@ -1714,7 +1633,19 @@
           <w:color w:val="172027"/>
           <w:sz w:val="22"/>
         </w:rPr>
-        <w:t>The graph keeps project-changing activity visible. It checks the request, builds context, plans when required, evaluates each side effect against policy, records tool activity, and validates the result before completion.</w:t>
+        <w:t>The registered graph uses one main executor spine. Short read-only work may finish directly; planning, explicit interrupts, approval-controlled tools, bounded read-only workers, validation, recovery, compaction and verification are entered only when needed.</w:t>
+      </w:r>
+    </w:p>
+    <w:p>
+      <w:r>
+        <w:rPr>
+          <w:rFonts w:ascii="Calibri" w:hAnsi="Calibri"/>
+          <w:b w:val="0"/>
+          <w:i w:val="0"/>
+          <w:color w:val="172027"/>
+          <w:sz w:val="22"/>
+        </w:rPr>
+        <w:t>Compaction is entered only when messages exceed context.summarize_after (default 10) and no tool calls are pending.</w:t>
       </w:r>
     </w:p>
     <w:p>
@@ -1722,7 +1653,7 @@
         <w:drawing>
           <wp:inline xmlns:a="http://schemas.openxmlformats.org/drawingml/2006/main" xmlns:pic="http://schemas.openxmlformats.org/drawingml/2006/picture">
             <wp:extent cx="5897880" cy="4128516"/>
-            <wp:docPr id="2" name="Picture 2" descr="Compass execution workflow from user task through guardrails, context and planning, executor, approval-controlled tools, validation and result recording."/>
+            <wp:docPr id="2" name="Picture 2" descr="All registered Compass StateGraph nodes grouped into entry, planning, read-only analysis, executor, validation and verification responsibilities."/>
             <wp:cNvGraphicFramePr>
               <a:graphicFrameLocks noChangeAspect="1"/>
             </wp:cNvGraphicFramePr>
@@ -1766,18 +1697,15 @@
           <w:color w:val="172027"/>
           <w:sz w:val="22"/>
         </w:rPr>
-        <w:t>Figure 2. Main execution path and approval-controlled tool loop.</w:t>
+        <w:t>Figure 2. Registered workflow-node inventory generated from the StateGraph builder.</w:t>
       </w:r>
     </w:p>
     <w:tbl>
       <w:tblPr>
         <w:tblStyle w:val="TableGrid"/>
-        <w:tblW w:type="auto" w:w="0"/>
+        <w:tblW w:type="dxa" w:w="9360"/>
         <w:tblLayout w:type="fixed"/>
         <w:tblLook w:firstColumn="1" w:firstRow="1" w:lastColumn="0" w:lastRow="0" w:noHBand="0" w:noVBand="1" w:val="04A0"/>
-        <w:tblW w:w="9360" w:type="dxa"/>
-        <w:tblInd w:w="120" w:type="dxa"/>
-        <w:tblW w:w="9360" w:type="dxa"/>
         <w:tblInd w:w="120" w:type="dxa"/>
       </w:tblPr>
       <w:tblGrid>
@@ -1791,21 +1719,15 @@
         </w:trPr>
         <w:tc>
           <w:tcPr>
-            <w:tcW w:type="dxa" w:w="3120"/>
-            <w:tcW w:w="1500" w:type="dxa"/>
+            <w:tcW w:type="dxa" w:w="1500"/>
             <w:vAlign w:val="center"/>
             <w:tcMar>
               <w:top w:w="80" w:type="dxa"/>
               <w:start w:w="120" w:type="dxa"/>
               <w:bottom w:w="80" w:type="dxa"/>
               <w:end w:w="120" w:type="dxa"/>
-              <w:top w:w="80" w:type="dxa"/>
-              <w:start w:w="120" w:type="dxa"/>
-              <w:bottom w:w="80" w:type="dxa"/>
-              <w:end w:w="120" w:type="dxa"/>
             </w:tcMar>
             <w:shd w:fill="E8EEF8"/>
-            <w:tcW w:w="1500" w:type="dxa"/>
           </w:tcPr>
           <w:p>
             <w:pPr>
@@ -1825,21 +1747,15 @@
         </w:tc>
         <w:tc>
           <w:tcPr>
-            <w:tcW w:type="dxa" w:w="3120"/>
-            <w:tcW w:w="3700" w:type="dxa"/>
+            <w:tcW w:type="dxa" w:w="3700"/>
             <w:vAlign w:val="center"/>
             <w:tcMar>
               <w:top w:w="80" w:type="dxa"/>
               <w:start w:w="120" w:type="dxa"/>
               <w:bottom w:w="80" w:type="dxa"/>
               <w:end w:w="120" w:type="dxa"/>
-              <w:top w:w="80" w:type="dxa"/>
-              <w:start w:w="120" w:type="dxa"/>
-              <w:bottom w:w="80" w:type="dxa"/>
-              <w:end w:w="120" w:type="dxa"/>
             </w:tcMar>
             <w:shd w:fill="E8EEF8"/>
-            <w:tcW w:w="3700" w:type="dxa"/>
           </w:tcPr>
           <w:p>
             <w:pPr>
@@ -1859,21 +1775,15 @@
         </w:tc>
         <w:tc>
           <w:tcPr>
-            <w:tcW w:type="dxa" w:w="3120"/>
-            <w:tcW w:w="4160" w:type="dxa"/>
+            <w:tcW w:type="dxa" w:w="4160"/>
             <w:vAlign w:val="center"/>
             <w:tcMar>
               <w:top w:w="80" w:type="dxa"/>
               <w:start w:w="120" w:type="dxa"/>
               <w:bottom w:w="80" w:type="dxa"/>
               <w:end w:w="120" w:type="dxa"/>
-              <w:top w:w="80" w:type="dxa"/>
-              <w:start w:w="120" w:type="dxa"/>
-              <w:bottom w:w="80" w:type="dxa"/>
-              <w:end w:w="120" w:type="dxa"/>
             </w:tcMar>
             <w:shd w:fill="E8EEF8"/>
-            <w:tcW w:w="4160" w:type="dxa"/>
           </w:tcPr>
           <w:p>
             <w:pPr>
@@ -1897,7 +1807,6 @@
           <w:tcPr>
             <w:tcW w:type="dxa" w:w="1500"/>
             <w:shd w:fill="F2F4F7"/>
-            <w:tcW w:w="1500" w:type="dxa"/>
             <w:vAlign w:val="center"/>
             <w:tcMar>
               <w:top w:w="80" w:type="dxa"/>
@@ -1925,7 +1834,6 @@
         <w:tc>
           <w:tcPr>
             <w:tcW w:type="dxa" w:w="3700"/>
-            <w:tcW w:w="3700" w:type="dxa"/>
             <w:vAlign w:val="center"/>
             <w:tcMar>
               <w:top w:w="80" w:type="dxa"/>
@@ -1953,7 +1861,6 @@
         <w:tc>
           <w:tcPr>
             <w:tcW w:type="dxa" w:w="4160"/>
-            <w:tcW w:w="4160" w:type="dxa"/>
             <w:vAlign w:val="center"/>
             <w:tcMar>
               <w:top w:w="80" w:type="dxa"/>
@@ -1984,7 +1891,6 @@
           <w:tcPr>
             <w:tcW w:type="dxa" w:w="1500"/>
             <w:shd w:fill="F2F4F7"/>
-            <w:tcW w:w="1500" w:type="dxa"/>
             <w:vAlign w:val="center"/>
             <w:tcMar>
               <w:top w:w="80" w:type="dxa"/>
@@ -2012,7 +1918,6 @@
         <w:tc>
           <w:tcPr>
             <w:tcW w:type="dxa" w:w="3700"/>
-            <w:tcW w:w="3700" w:type="dxa"/>
             <w:vAlign w:val="center"/>
             <w:tcMar>
               <w:top w:w="80" w:type="dxa"/>
@@ -2040,7 +1945,6 @@
         <w:tc>
           <w:tcPr>
             <w:tcW w:type="dxa" w:w="4160"/>
-            <w:tcW w:w="4160" w:type="dxa"/>
             <w:vAlign w:val="center"/>
             <w:tcMar>
               <w:top w:w="80" w:type="dxa"/>
@@ -2071,7 +1975,6 @@
           <w:tcPr>
             <w:tcW w:type="dxa" w:w="1500"/>
             <w:shd w:fill="F2F4F7"/>
-            <w:tcW w:w="1500" w:type="dxa"/>
             <w:vAlign w:val="center"/>
             <w:tcMar>
               <w:top w:w="80" w:type="dxa"/>
@@ -2099,7 +2002,6 @@
         <w:tc>
           <w:tcPr>
             <w:tcW w:type="dxa" w:w="3700"/>
-            <w:tcW w:w="3700" w:type="dxa"/>
             <w:vAlign w:val="center"/>
             <w:tcMar>
               <w:top w:w="80" w:type="dxa"/>
@@ -2127,7 +2029,6 @@
         <w:tc>
           <w:tcPr>
             <w:tcW w:type="dxa" w:w="4160"/>
-            <w:tcW w:w="4160" w:type="dxa"/>
             <w:vAlign w:val="center"/>
             <w:tcMar>
               <w:top w:w="80" w:type="dxa"/>
@@ -2158,7 +2059,6 @@
           <w:tcPr>
             <w:tcW w:type="dxa" w:w="1500"/>
             <w:shd w:fill="F2F4F7"/>
-            <w:tcW w:w="1500" w:type="dxa"/>
             <w:vAlign w:val="center"/>
             <w:tcMar>
               <w:top w:w="80" w:type="dxa"/>
@@ -2186,7 +2086,6 @@
         <w:tc>
           <w:tcPr>
             <w:tcW w:type="dxa" w:w="3700"/>
-            <w:tcW w:w="3700" w:type="dxa"/>
             <w:vAlign w:val="center"/>
             <w:tcMar>
               <w:top w:w="80" w:type="dxa"/>
@@ -2214,7 +2113,6 @@
         <w:tc>
           <w:tcPr>
             <w:tcW w:type="dxa" w:w="4160"/>
-            <w:tcW w:w="4160" w:type="dxa"/>
             <w:vAlign w:val="center"/>
             <w:tcMar>
               <w:top w:w="80" w:type="dxa"/>
@@ -2257,12 +2155,9 @@
     <w:tbl>
       <w:tblPr>
         <w:tblStyle w:val="TableGrid"/>
-        <w:tblW w:type="auto" w:w="0"/>
+        <w:tblW w:type="dxa" w:w="9360"/>
         <w:tblLayout w:type="fixed"/>
         <w:tblLook w:firstColumn="1" w:firstRow="1" w:lastColumn="0" w:lastRow="0" w:noHBand="0" w:noVBand="1" w:val="04A0"/>
-        <w:tblW w:w="9360" w:type="dxa"/>
-        <w:tblInd w:w="120" w:type="dxa"/>
-        <w:tblW w:w="9360" w:type="dxa"/>
         <w:tblInd w:w="120" w:type="dxa"/>
       </w:tblPr>
       <w:tblGrid>
@@ -2276,21 +2171,15 @@
         </w:trPr>
         <w:tc>
           <w:tcPr>
-            <w:tcW w:type="dxa" w:w="3120"/>
-            <w:tcW w:w="2250" w:type="dxa"/>
+            <w:tcW w:type="dxa" w:w="2250"/>
             <w:vAlign w:val="center"/>
             <w:tcMar>
               <w:top w:w="80" w:type="dxa"/>
               <w:start w:w="120" w:type="dxa"/>
               <w:bottom w:w="80" w:type="dxa"/>
               <w:end w:w="120" w:type="dxa"/>
-              <w:top w:w="80" w:type="dxa"/>
-              <w:start w:w="120" w:type="dxa"/>
-              <w:bottom w:w="80" w:type="dxa"/>
-              <w:end w:w="120" w:type="dxa"/>
             </w:tcMar>
             <w:shd w:fill="E8EEF8"/>
-            <w:tcW w:w="2250" w:type="dxa"/>
           </w:tcPr>
           <w:p>
             <w:pPr>
@@ -2310,21 +2199,15 @@
         </w:tc>
         <w:tc>
           <w:tcPr>
-            <w:tcW w:type="dxa" w:w="3120"/>
-            <w:tcW w:w="4400" w:type="dxa"/>
+            <w:tcW w:type="dxa" w:w="4400"/>
             <w:vAlign w:val="center"/>
             <w:tcMar>
               <w:top w:w="80" w:type="dxa"/>
               <w:start w:w="120" w:type="dxa"/>
               <w:bottom w:w="80" w:type="dxa"/>
               <w:end w:w="120" w:type="dxa"/>
-              <w:top w:w="80" w:type="dxa"/>
-              <w:start w:w="120" w:type="dxa"/>
-              <w:bottom w:w="80" w:type="dxa"/>
-              <w:end w:w="120" w:type="dxa"/>
             </w:tcMar>
             <w:shd w:fill="E8EEF8"/>
-            <w:tcW w:w="4400" w:type="dxa"/>
           </w:tcPr>
           <w:p>
             <w:pPr>
@@ -2344,21 +2227,15 @@
         </w:tc>
         <w:tc>
           <w:tcPr>
-            <w:tcW w:type="dxa" w:w="3120"/>
-            <w:tcW w:w="2710" w:type="dxa"/>
+            <w:tcW w:type="dxa" w:w="2710"/>
             <w:vAlign w:val="center"/>
             <w:tcMar>
               <w:top w:w="80" w:type="dxa"/>
               <w:start w:w="120" w:type="dxa"/>
               <w:bottom w:w="80" w:type="dxa"/>
               <w:end w:w="120" w:type="dxa"/>
-              <w:top w:w="80" w:type="dxa"/>
-              <w:start w:w="120" w:type="dxa"/>
-              <w:bottom w:w="80" w:type="dxa"/>
-              <w:end w:w="120" w:type="dxa"/>
             </w:tcMar>
             <w:shd w:fill="E8EEF8"/>
-            <w:tcW w:w="2710" w:type="dxa"/>
           </w:tcPr>
           <w:p>
             <w:pPr>
@@ -2382,7 +2259,6 @@
           <w:tcPr>
             <w:tcW w:type="dxa" w:w="2250"/>
             <w:shd w:fill="F2F4F7"/>
-            <w:tcW w:w="2250" w:type="dxa"/>
             <w:vAlign w:val="center"/>
             <w:tcMar>
               <w:top w:w="80" w:type="dxa"/>
@@ -2410,7 +2286,6 @@
         <w:tc>
           <w:tcPr>
             <w:tcW w:type="dxa" w:w="4400"/>
-            <w:tcW w:w="4400" w:type="dxa"/>
             <w:vAlign w:val="center"/>
             <w:tcMar>
               <w:top w:w="80" w:type="dxa"/>
@@ -2438,7 +2313,6 @@
         <w:tc>
           <w:tcPr>
             <w:tcW w:type="dxa" w:w="2710"/>
-            <w:tcW w:w="2710" w:type="dxa"/>
             <w:vAlign w:val="center"/>
             <w:tcMar>
               <w:top w:w="80" w:type="dxa"/>
@@ -2469,7 +2343,6 @@
           <w:tcPr>
             <w:tcW w:type="dxa" w:w="2250"/>
             <w:shd w:fill="F2F4F7"/>
-            <w:tcW w:w="2250" w:type="dxa"/>
             <w:vAlign w:val="center"/>
             <w:tcMar>
               <w:top w:w="80" w:type="dxa"/>
@@ -2497,7 +2370,6 @@
         <w:tc>
           <w:tcPr>
             <w:tcW w:type="dxa" w:w="4400"/>
-            <w:tcW w:w="4400" w:type="dxa"/>
             <w:vAlign w:val="center"/>
             <w:tcMar>
               <w:top w:w="80" w:type="dxa"/>
@@ -2525,7 +2397,6 @@
         <w:tc>
           <w:tcPr>
             <w:tcW w:type="dxa" w:w="2710"/>
-            <w:tcW w:w="2710" w:type="dxa"/>
             <w:vAlign w:val="center"/>
             <w:tcMar>
               <w:top w:w="80" w:type="dxa"/>
@@ -2556,7 +2427,6 @@
           <w:tcPr>
             <w:tcW w:type="dxa" w:w="2250"/>
             <w:shd w:fill="F2F4F7"/>
-            <w:tcW w:w="2250" w:type="dxa"/>
             <w:vAlign w:val="center"/>
             <w:tcMar>
               <w:top w:w="80" w:type="dxa"/>
@@ -2584,7 +2454,6 @@
         <w:tc>
           <w:tcPr>
             <w:tcW w:type="dxa" w:w="4400"/>
-            <w:tcW w:w="4400" w:type="dxa"/>
             <w:vAlign w:val="center"/>
             <w:tcMar>
               <w:top w:w="80" w:type="dxa"/>
@@ -2612,7 +2481,6 @@
         <w:tc>
           <w:tcPr>
             <w:tcW w:type="dxa" w:w="2710"/>
-            <w:tcW w:w="2710" w:type="dxa"/>
             <w:vAlign w:val="center"/>
             <w:tcMar>
               <w:top w:w="80" w:type="dxa"/>
@@ -2643,7 +2511,6 @@
           <w:tcPr>
             <w:tcW w:type="dxa" w:w="2250"/>
             <w:shd w:fill="F2F4F7"/>
-            <w:tcW w:w="2250" w:type="dxa"/>
             <w:vAlign w:val="center"/>
             <w:tcMar>
               <w:top w:w="80" w:type="dxa"/>
@@ -2671,7 +2538,6 @@
         <w:tc>
           <w:tcPr>
             <w:tcW w:type="dxa" w:w="4400"/>
-            <w:tcW w:w="4400" w:type="dxa"/>
             <w:vAlign w:val="center"/>
             <w:tcMar>
               <w:top w:w="80" w:type="dxa"/>
@@ -2699,7 +2565,6 @@
         <w:tc>
           <w:tcPr>
             <w:tcW w:type="dxa" w:w="2710"/>
-            <w:tcW w:w="2710" w:type="dxa"/>
             <w:vAlign w:val="center"/>
             <w:tcMar>
               <w:top w:w="80" w:type="dxa"/>
@@ -2730,7 +2595,6 @@
           <w:tcPr>
             <w:tcW w:type="dxa" w:w="2250"/>
             <w:shd w:fill="F2F4F7"/>
-            <w:tcW w:w="2250" w:type="dxa"/>
             <w:vAlign w:val="center"/>
             <w:tcMar>
               <w:top w:w="80" w:type="dxa"/>
@@ -2758,7 +2622,6 @@
         <w:tc>
           <w:tcPr>
             <w:tcW w:type="dxa" w:w="4400"/>
-            <w:tcW w:w="4400" w:type="dxa"/>
             <w:vAlign w:val="center"/>
             <w:tcMar>
               <w:top w:w="80" w:type="dxa"/>
@@ -2786,7 +2649,6 @@
         <w:tc>
           <w:tcPr>
             <w:tcW w:type="dxa" w:w="2710"/>
-            <w:tcW w:w="2710" w:type="dxa"/>
             <w:vAlign w:val="center"/>
             <w:tcMar>
               <w:top w:w="80" w:type="dxa"/>
@@ -2855,7 +2717,7 @@
           <w:color w:val="172027"/>
           <w:sz w:val="22"/>
         </w:rPr>
-        <w:t>Approvals offer Yes, No, Always and Skip decisions.</w:t>
+        <w:t>Plan, tool and clarification requests use typed interrupts; approval actions are Execute/Revise/Cancel or Yes/No/Always/Skip as appropriate.</w:t>
       </w:r>
     </w:p>
     <w:p>
@@ -2887,7 +2749,7 @@
           <w:color w:val="172027"/>
           <w:sz w:val="22"/>
         </w:rPr>
-        <w:t>Web workspaces are ownership-checked and reject absolute paths or traversal.</w:t>
+        <w:t>Web workspaces are ownership-checked, use one explicit active workspace and reject absolute paths or traversal.</w:t>
       </w:r>
     </w:p>
     <w:p>
@@ -2903,7 +2765,23 @@
           <w:color w:val="172027"/>
           <w:sz w:val="22"/>
         </w:rPr>
-        <w:t>GitHub access is separate from identity login; stored provider credentials are encrypted by the backend.</w:t>
+        <w:t>Access tokens stay in browser memory; rotating, single-use refresh tokens use an HttpOnly cookie scoped to /api/auth, and refresh generation advances before the next token is issued.</w:t>
+      </w:r>
+    </w:p>
+    <w:p>
+      <w:pPr>
+        <w:pStyle w:val="ListBullet"/>
+        <w:spacing w:after="80" w:line="276" w:lineRule="auto"/>
+      </w:pPr>
+      <w:r>
+        <w:rPr>
+          <w:rFonts w:ascii="Calibri" w:hAnsi="Calibri"/>
+          <w:b w:val="0"/>
+          <w:i w:val="0"/>
+          <w:color w:val="172027"/>
+          <w:sz w:val="22"/>
+        </w:rPr>
+        <w:t>Stored provider credentials are encrypted with the configured credential key.</w:t>
       </w:r>
     </w:p>
     <w:p>
@@ -2960,12 +2838,9 @@
     <w:tbl>
       <w:tblPr>
         <w:tblStyle w:val="TableGrid"/>
-        <w:tblW w:type="auto" w:w="0"/>
+        <w:tblW w:type="dxa" w:w="9360"/>
         <w:tblLayout w:type="fixed"/>
         <w:tblLook w:firstColumn="1" w:firstRow="1" w:lastColumn="0" w:lastRow="0" w:noHBand="0" w:noVBand="1" w:val="04A0"/>
-        <w:tblW w:w="9360" w:type="dxa"/>
-        <w:tblInd w:w="120" w:type="dxa"/>
-        <w:tblW w:w="9360" w:type="dxa"/>
         <w:tblInd w:w="120" w:type="dxa"/>
       </w:tblPr>
       <w:tblGrid>
@@ -2979,21 +2854,15 @@
         </w:trPr>
         <w:tc>
           <w:tcPr>
-            <w:tcW w:type="dxa" w:w="3120"/>
-            <w:tcW w:w="1450" w:type="dxa"/>
+            <w:tcW w:type="dxa" w:w="1450"/>
             <w:vAlign w:val="center"/>
             <w:tcMar>
               <w:top w:w="80" w:type="dxa"/>
               <w:start w:w="120" w:type="dxa"/>
               <w:bottom w:w="80" w:type="dxa"/>
               <w:end w:w="120" w:type="dxa"/>
-              <w:top w:w="80" w:type="dxa"/>
-              <w:start w:w="120" w:type="dxa"/>
-              <w:bottom w:w="80" w:type="dxa"/>
-              <w:end w:w="120" w:type="dxa"/>
             </w:tcMar>
             <w:shd w:fill="E8EEF8"/>
-            <w:tcW w:w="1450" w:type="dxa"/>
           </w:tcPr>
           <w:p>
             <w:pPr>
@@ -3013,21 +2882,15 @@
         </w:tc>
         <w:tc>
           <w:tcPr>
-            <w:tcW w:type="dxa" w:w="3120"/>
-            <w:tcW w:w="5000" w:type="dxa"/>
+            <w:tcW w:type="dxa" w:w="5000"/>
             <w:vAlign w:val="center"/>
             <w:tcMar>
               <w:top w:w="80" w:type="dxa"/>
               <w:start w:w="120" w:type="dxa"/>
               <w:bottom w:w="80" w:type="dxa"/>
               <w:end w:w="120" w:type="dxa"/>
-              <w:top w:w="80" w:type="dxa"/>
-              <w:start w:w="120" w:type="dxa"/>
-              <w:bottom w:w="80" w:type="dxa"/>
-              <w:end w:w="120" w:type="dxa"/>
             </w:tcMar>
             <w:shd w:fill="E8EEF8"/>
-            <w:tcW w:w="5000" w:type="dxa"/>
           </w:tcPr>
           <w:p>
             <w:pPr>
@@ -3047,21 +2910,15 @@
         </w:tc>
         <w:tc>
           <w:tcPr>
-            <w:tcW w:type="dxa" w:w="3120"/>
-            <w:tcW w:w="2910" w:type="dxa"/>
+            <w:tcW w:type="dxa" w:w="2910"/>
             <w:vAlign w:val="center"/>
             <w:tcMar>
               <w:top w:w="80" w:type="dxa"/>
               <w:start w:w="120" w:type="dxa"/>
               <w:bottom w:w="80" w:type="dxa"/>
               <w:end w:w="120" w:type="dxa"/>
-              <w:top w:w="80" w:type="dxa"/>
-              <w:start w:w="120" w:type="dxa"/>
-              <w:bottom w:w="80" w:type="dxa"/>
-              <w:end w:w="120" w:type="dxa"/>
             </w:tcMar>
             <w:shd w:fill="E8EEF8"/>
-            <w:tcW w:w="2910" w:type="dxa"/>
           </w:tcPr>
           <w:p>
             <w:pPr>
@@ -3085,7 +2942,6 @@
           <w:tcPr>
             <w:tcW w:type="dxa" w:w="1450"/>
             <w:shd w:fill="F2F4F7"/>
-            <w:tcW w:w="1450" w:type="dxa"/>
             <w:vAlign w:val="center"/>
             <w:tcMar>
               <w:top w:w="80" w:type="dxa"/>
@@ -3113,7 +2969,6 @@
         <w:tc>
           <w:tcPr>
             <w:tcW w:type="dxa" w:w="5000"/>
-            <w:tcW w:w="5000" w:type="dxa"/>
             <w:vAlign w:val="center"/>
             <w:tcMar>
               <w:top w:w="80" w:type="dxa"/>
@@ -3141,7 +2996,6 @@
         <w:tc>
           <w:tcPr>
             <w:tcW w:type="dxa" w:w="2910"/>
-            <w:tcW w:w="2910" w:type="dxa"/>
             <w:vAlign w:val="center"/>
             <w:tcMar>
               <w:top w:w="80" w:type="dxa"/>
@@ -3172,7 +3026,6 @@
           <w:tcPr>
             <w:tcW w:type="dxa" w:w="1450"/>
             <w:shd w:fill="F2F4F7"/>
-            <w:tcW w:w="1450" w:type="dxa"/>
             <w:vAlign w:val="center"/>
             <w:tcMar>
               <w:top w:w="80" w:type="dxa"/>
@@ -3200,7 +3053,6 @@
         <w:tc>
           <w:tcPr>
             <w:tcW w:type="dxa" w:w="5000"/>
-            <w:tcW w:w="5000" w:type="dxa"/>
             <w:vAlign w:val="center"/>
             <w:tcMar>
               <w:top w:w="80" w:type="dxa"/>
@@ -3228,7 +3080,6 @@
         <w:tc>
           <w:tcPr>
             <w:tcW w:type="dxa" w:w="2910"/>
-            <w:tcW w:w="2910" w:type="dxa"/>
             <w:vAlign w:val="center"/>
             <w:tcMar>
               <w:top w:w="80" w:type="dxa"/>
@@ -3259,7 +3110,6 @@
           <w:tcPr>
             <w:tcW w:type="dxa" w:w="1450"/>
             <w:shd w:fill="F2F4F7"/>
-            <w:tcW w:w="1450" w:type="dxa"/>
             <w:vAlign w:val="center"/>
             <w:tcMar>
               <w:top w:w="80" w:type="dxa"/>
@@ -3287,7 +3137,6 @@
         <w:tc>
           <w:tcPr>
             <w:tcW w:type="dxa" w:w="5000"/>
-            <w:tcW w:w="5000" w:type="dxa"/>
             <w:vAlign w:val="center"/>
             <w:tcMar>
               <w:top w:w="80" w:type="dxa"/>
@@ -3315,7 +3164,6 @@
         <w:tc>
           <w:tcPr>
             <w:tcW w:type="dxa" w:w="2910"/>
-            <w:tcW w:w="2910" w:type="dxa"/>
             <w:vAlign w:val="center"/>
             <w:tcMar>
               <w:top w:w="80" w:type="dxa"/>
@@ -3346,7 +3194,6 @@
           <w:tcPr>
             <w:tcW w:type="dxa" w:w="1450"/>
             <w:shd w:fill="F2F4F7"/>
-            <w:tcW w:w="1450" w:type="dxa"/>
             <w:vAlign w:val="center"/>
             <w:tcMar>
               <w:top w:w="80" w:type="dxa"/>
@@ -3374,7 +3221,6 @@
         <w:tc>
           <w:tcPr>
             <w:tcW w:type="dxa" w:w="5000"/>
-            <w:tcW w:w="5000" w:type="dxa"/>
             <w:vAlign w:val="center"/>
             <w:tcMar>
               <w:top w:w="80" w:type="dxa"/>
@@ -3402,7 +3248,6 @@
         <w:tc>
           <w:tcPr>
             <w:tcW w:type="dxa" w:w="2910"/>
-            <w:tcW w:w="2910" w:type="dxa"/>
             <w:vAlign w:val="center"/>
             <w:tcMar>
               <w:top w:w="80" w:type="dxa"/>
@@ -3433,7 +3278,6 @@
           <w:tcPr>
             <w:tcW w:type="dxa" w:w="1450"/>
             <w:shd w:fill="F2F4F7"/>
-            <w:tcW w:w="1450" w:type="dxa"/>
             <w:vAlign w:val="center"/>
             <w:tcMar>
               <w:top w:w="80" w:type="dxa"/>
@@ -3461,7 +3305,6 @@
         <w:tc>
           <w:tcPr>
             <w:tcW w:type="dxa" w:w="5000"/>
-            <w:tcW w:w="5000" w:type="dxa"/>
             <w:vAlign w:val="center"/>
             <w:tcMar>
               <w:top w:w="80" w:type="dxa"/>
@@ -3489,7 +3332,6 @@
         <w:tc>
           <w:tcPr>
             <w:tcW w:type="dxa" w:w="2910"/>
-            <w:tcW w:w="2910" w:type="dxa"/>
             <w:vAlign w:val="center"/>
             <w:tcMar>
               <w:top w:w="80" w:type="dxa"/>
@@ -3520,7 +3362,6 @@
           <w:tcPr>
             <w:tcW w:type="dxa" w:w="1450"/>
             <w:shd w:fill="F2F4F7"/>
-            <w:tcW w:w="1450" w:type="dxa"/>
             <w:vAlign w:val="center"/>
             <w:tcMar>
               <w:top w:w="80" w:type="dxa"/>
@@ -3548,7 +3389,6 @@
         <w:tc>
           <w:tcPr>
             <w:tcW w:type="dxa" w:w="5000"/>
-            <w:tcW w:w="5000" w:type="dxa"/>
             <w:vAlign w:val="center"/>
             <w:tcMar>
               <w:top w:w="80" w:type="dxa"/>
@@ -3576,7 +3416,6 @@
         <w:tc>
           <w:tcPr>
             <w:tcW w:type="dxa" w:w="2910"/>
-            <w:tcW w:w="2910" w:type="dxa"/>
             <w:vAlign w:val="center"/>
             <w:tcMar>
               <w:top w:w="80" w:type="dxa"/>

</xml_diff>